<commit_message>
[patch] letter to Prezes: salutation; sent via NAIS 28.10 (resend 01a1812f)
Co-Authored-By: Claude Opus 5.5 <noreply@anthropic.com>
</commit_message>
<xml_diff>
--- a/docs/LIST_DO_PREZESA_SLA_AUTENTI_2026-10-28.docx
+++ b/docs/LIST_DO_PREZESA_SLA_AUTENTI_2026-10-28.docx
@@ -80,7 +80,15 @@
         <w:pStyle w:val="FirstParagraph"/>
       </w:pPr>
       <w:r>
-        <w:t xml:space="preserve">Poniżej opisuję, co według mnie trzeba zrobić, żeby za błędy podwykonawców nie płaciła firma, i co w tym ma zrobić Jolka. Na końcu są decyzje, których potrzebuję od Ciebie.</w:t>
+        <w:t xml:space="preserve">Tato,</w:t>
+      </w:r>
+    </w:p>
+    <w:p>
+      <w:pPr>
+        <w:pStyle w:val="BodyText"/>
+      </w:pPr>
+      <w:r>
+        <w:t xml:space="preserve">poniżej opisuję, co według mnie trzeba zrobić, żeby za błędy podwykonawców nie płaciła firma, i co w tym ma zrobić Jolka. Na końcu są decyzje, których potrzebuję od Ciebie.</w:t>
       </w:r>
     </w:p>
     <w:bookmarkStart w:id="9" w:name="X416cdb8a5059d2a847389be09e27db1ab3c0e48"/>

</xml_diff>